<commit_message>
Add NoseyMutt logo PNGs (wordmark, light, mark, favicon)
- storefront/brand-assets/: transparent-PNG wordmark + cream-text variant +
  standalone nose-badge mark + 512px favicon (Quicksand Bold, brand palette)
- Wire real files into the Shopify walkthrough (logo/favicon steps) + brand.md
- brand-assets/README with usage + JPG-conversion snippet
- Regenerated the .docx guide to match

Co-Authored-By: Claude Opus 4.8 (1M context) <noreply@anthropic.com>
</commit_message>
<xml_diff>
--- a/storefront/NoseyMutt-Shopify-Setup-Guide.docx
+++ b/storefront/NoseyMutt-Shopify-Setup-Guide.docx
@@ -513,7 +513,64 @@
       </w:r>
       <w:r>
         <w:rPr/>
-        <w:t xml:space="preserve"> (optional). Free path: Canva or Shopify's free logo maker. A simple "NoseyMutt" wordmark is enough to launch. If you buy one on Fiverr (~$15), 💲 log it. </w:t>
+        <w:t xml:space="preserve"> — ✅ </w:t>
+      </w:r>
+      <w:r>
+        <w:rPr>
+          <w:rStyle w:val="Strong"/>
+        </w:rPr>
+        <w:t>already made for you</w:t>
+      </w:r>
+      <w:r>
+        <w:rPr/>
+        <w:t xml:space="preserve"> in </w:t>
+      </w:r>
+      <w:hyperlink r:id="rId2">
+        <w:r>
+          <w:rPr>
+            <w:rStyle w:val="Hyperlink"/>
+            <w:rFonts w:ascii="Consolas;monospace" w:hAnsi="Consolas;monospace" w:eastAsia="Consolas;monospace" w:cs="Consolas;monospace"/>
+            <w:sz w:val="20"/>
+            <w:sz w:val="20"/>
+            <w:szCs w:val="20"/>
+            <w:shd w:fill="F3ECE0" w:val="clear"/>
+          </w:rPr>
+          <w:t>storefront/brand-assets/</w:t>
+        </w:r>
+      </w:hyperlink>
+      <w:r>
+        <w:rPr/>
+        <w:t xml:space="preserve">: </w:t>
+      </w:r>
+      <w:r>
+        <w:rPr>
+          <w:rStyle w:val="SourceText"/>
+        </w:rPr>
+        <w:t>logo-noseymutt.png</w:t>
+      </w:r>
+      <w:r>
+        <w:rPr/>
+        <w:t xml:space="preserve"> (wordmark for the header), </w:t>
+      </w:r>
+      <w:r>
+        <w:rPr>
+          <w:rStyle w:val="SourceText"/>
+        </w:rPr>
+        <w:t>logo-noseymutt-light.png</w:t>
+      </w:r>
+      <w:r>
+        <w:rPr/>
+        <w:t xml:space="preserve"> (cream text for the dark footer), and </w:t>
+      </w:r>
+      <w:r>
+        <w:rPr>
+          <w:rStyle w:val="SourceText"/>
+        </w:rPr>
+        <w:t>favicon.png</w:t>
+      </w:r>
+      <w:r>
+        <w:rPr/>
+        <w:t xml:space="preserve"> (browser-tab icon). Nothing to buy. You can replace them later with a custom logo if you want, but these are launch-ready. </w:t>
       </w:r>
     </w:p>
     <w:p>
@@ -1218,7 +1275,7 @@
         </w:rPr>
         <w:t xml:space="preserve">Verified pricing (June 2026, from </w:t>
       </w:r>
-      <w:hyperlink r:id="rId2">
+      <w:hyperlink r:id="rId3">
         <w:r>
           <w:rPr>
             <w:rStyle w:val="Hyperlink"/>
@@ -2088,7 +2145,7 @@
         <w:rPr/>
         <w:t xml:space="preserve"> (</w:t>
       </w:r>
-      <w:hyperlink r:id="rId3">
+      <w:hyperlink r:id="rId4">
         <w:r>
           <w:rPr>
             <w:rStyle w:val="Hyperlink"/>
@@ -2990,7 +3047,17 @@
       </w:r>
       <w:r>
         <w:rPr/>
-        <w:t xml:space="preserve">, upload your NoseyMutt wordmark PNG (transparent background looks best). Set a sensible </w:t>
+        <w:t xml:space="preserve">, upload </w:t>
+      </w:r>
+      <w:r>
+        <w:rPr>
+          <w:rStyle w:val="SourceText"/>
+        </w:rPr>
+        <w:t>storefront/brand-assets/logo-noseymutt.png</w:t>
+      </w:r>
+      <w:r>
+        <w:rPr/>
+        <w:t xml:space="preserve"> (transparent background, ready to go). Set a sensible </w:t>
       </w:r>
       <w:r>
         <w:rPr>
@@ -3000,7 +3067,29 @@
       </w:r>
       <w:r>
         <w:rPr/>
-        <w:t xml:space="preserve"> (~120–160px). If you have no logo yet, leave the text store name showing — you can add the logo later. </w:t>
+        <w:t xml:space="preserve"> (~140–170px). </w:t>
+      </w:r>
+      <w:r>
+        <w:rPr>
+          <w:rStyle w:val="Emphasis"/>
+        </w:rPr>
+        <w:t xml:space="preserve">(For the dark footer, if Dawn lets you set a separate footer logo, use </w:t>
+      </w:r>
+      <w:r>
+        <w:rPr>
+          <w:rStyle w:val="SourceText"/>
+        </w:rPr>
+        <w:t>logo-noseymutt-light.png</w:t>
+      </w:r>
+      <w:r>
+        <w:rPr>
+          <w:rStyle w:val="Emphasis"/>
+        </w:rPr>
+        <w:t xml:space="preserve"> so the text stays readable on Ink.)</w:t>
+      </w:r>
+      <w:r>
+        <w:rPr/>
+        <w:t xml:space="preserve"> </w:t>
       </w:r>
     </w:p>
     <w:p>
@@ -3038,7 +3127,17 @@
       </w:r>
       <w:r>
         <w:rPr/>
-        <w:t xml:space="preserve"> → upload a small square version of the logo/glyph (32×32 works). </w:t>
+        <w:t xml:space="preserve"> → upload </w:t>
+      </w:r>
+      <w:r>
+        <w:rPr>
+          <w:rStyle w:val="SourceText"/>
+        </w:rPr>
+        <w:t>storefront/brand-assets/favicon.png</w:t>
+      </w:r>
+      <w:r>
+        <w:rPr/>
+        <w:t xml:space="preserve"> (the nose mark; Shopify auto-resizes it). </w:t>
       </w:r>
     </w:p>
     <w:p>
@@ -9807,7 +9906,7 @@
         <w:rPr/>
         <w:t xml:space="preserve">Shopify plans, prices, free trial, $1/mo×3 promo, transaction &amp; 3rd-party fees — </w:t>
       </w:r>
-      <w:hyperlink r:id="rId4">
+      <w:hyperlink r:id="rId5">
         <w:r>
           <w:rPr>
             <w:rStyle w:val="Hyperlink"/>
@@ -9841,7 +9940,7 @@
         <w:rPr/>
         <w:t xml:space="preserve">$1/mo-for-3-months promo mechanics (monthly-only; new accounts only) — </w:t>
       </w:r>
-      <w:hyperlink r:id="rId5">
+      <w:hyperlink r:id="rId6">
         <w:r>
           <w:rPr>
             <w:rStyle w:val="Hyperlink"/>
@@ -9853,7 +9952,7 @@
         <w:rPr/>
         <w:t xml:space="preserve">, </w:t>
       </w:r>
-      <w:hyperlink r:id="rId6">
+      <w:hyperlink r:id="rId7">
         <w:r>
           <w:rPr>
             <w:rStyle w:val="Hyperlink"/>
@@ -9887,7 +9986,7 @@
         <w:rPr/>
         <w:t xml:space="preserve">Basic fees (2.9%+30¢ Shopify Payments; 2% third-party on Basic) — </w:t>
       </w:r>
-      <w:hyperlink r:id="rId7">
+      <w:hyperlink r:id="rId8">
         <w:r>
           <w:rPr>
             <w:rStyle w:val="Hyperlink"/>
@@ -9921,7 +10020,7 @@
         <w:rPr/>
         <w:t xml:space="preserve">Dawn theme is the free default; color schemes + typography editor — </w:t>
       </w:r>
-      <w:hyperlink r:id="rId8">
+      <w:hyperlink r:id="rId9">
         <w:r>
           <w:rPr>
             <w:rStyle w:val="Hyperlink"/>
@@ -9955,7 +10054,7 @@
         <w:rPr/>
         <w:t xml:space="preserve">DSers free plan, install + auto order/tracking — </w:t>
       </w:r>
-      <w:hyperlink r:id="rId9">
+      <w:hyperlink r:id="rId10">
         <w:r>
           <w:rPr>
             <w:rStyle w:val="Hyperlink"/>
@@ -9967,7 +10066,7 @@
         <w:rPr/>
         <w:t xml:space="preserve">, </w:t>
       </w:r>
-      <w:hyperlink r:id="rId10">
+      <w:hyperlink r:id="rId11">
         <w:r>
           <w:rPr>
             <w:rStyle w:val="Hyperlink"/>
@@ -10001,7 +10100,7 @@
         <w:rPr/>
         <w:t xml:space="preserve">CJdropshipping free Shopify app, connect + auto-fulfill — </w:t>
       </w:r>
-      <w:hyperlink r:id="rId11">
+      <w:hyperlink r:id="rId12">
         <w:r>
           <w:rPr>
             <w:rStyle w:val="Hyperlink"/>
@@ -10034,7 +10133,7 @@
         <w:rPr/>
         <w:t xml:space="preserve">Free order-bump/upsell apps (Selleasy ~100 orders/mo free; ReConvert ~49 orders/mo free; Releasit free = dev stores only) — </w:t>
       </w:r>
-      <w:hyperlink r:id="rId12">
+      <w:hyperlink r:id="rId13">
         <w:r>
           <w:rPr>
             <w:rStyle w:val="Hyperlink"/>
@@ -11760,13 +11859,6 @@
     <w:qFormat/>
     <w:rPr/>
   </w:style>
-  <w:style w:type="character" w:styleId="Bullets">
-    <w:name w:val="Bullets"/>
-    <w:qFormat/>
-    <w:rPr>
-      <w:rFonts w:ascii="OpenSymbol" w:hAnsi="OpenSymbol" w:eastAsia="OpenSymbol" w:cs="OpenSymbol"/>
-    </w:rPr>
-  </w:style>
   <w:style w:type="character" w:styleId="FollowedHyperlink">
     <w:name w:val="FollowedHyperlink"/>
     <w:rPr>
@@ -11775,6 +11867,13 @@
       <w:color w:val="7E9B6E"/>
       <w:u w:val="none"/>
       <w:effect w:val="none"/>
+    </w:rPr>
+  </w:style>
+  <w:style w:type="character" w:styleId="Bullets">
+    <w:name w:val="Bullets"/>
+    <w:qFormat/>
+    <w:rPr>
+      <w:rFonts w:ascii="OpenSymbol" w:hAnsi="OpenSymbol" w:eastAsia="OpenSymbol" w:cs="OpenSymbol"/>
     </w:rPr>
   </w:style>
   <w:style w:type="paragraph" w:styleId="HorizontalLine">

</xml_diff>